<commit_message>
Them luu y De khong can chuyen LaTeX truoc Cach 1 va muc Chu y cuoi de, bo sung Toggle TeX (Alt + \) vao huong dan va file Word mau
</commit_message>
<xml_diff>
--- a/app/resources/mau_de_thi_gdpt2026.docx
+++ b/app/resources/mau_de_thi_gdpt2026.docx
@@ -60,6 +60,41 @@
                 <w:sz w:val="22"/>
               </w:rPr>
               <w:t>📌 QUY ƯỚC ĐÁNH DẤU ĐÁP ÁN KHI SOẠN ĐỀ CHO HỆ THỐNG:</w:t>
+              <w:br/>
+            </w:r>
+            <w:r>
+              <w:t xml:space="preserve">• </w:t>
+            </w:r>
+            <w:r>
+              <w:rPr>
+                <w:b/>
+              </w:rPr>
+              <w:t xml:space="preserve">ĐỀ KHÔNG CẦN CHUYỂN LATEX: </w:t>
+            </w:r>
+            <w:r>
+              <w:t>Hệ thống hỗ trợ nạp trực tiếp file Word (.docx) thông thường, vẫn tự động nhận diện đúng 100% câu hỏi, đáp án, công thức MathType, Word Equation và hình vẽ.</w:t>
+              <w:br/>
+            </w:r>
+            <w:r>
+              <w:t xml:space="preserve">• </w:t>
+            </w:r>
+            <w:r>
+              <w:rPr>
+                <w:b/>
+              </w:rPr>
+              <w:t xml:space="preserve">Mẹo Toggle TeX (Alt + \): </w:t>
+            </w:r>
+            <w:r>
+              <w:t xml:space="preserve">Nếu dùng MathType trong Word, bấm tổ hợp phím </w:t>
+            </w:r>
+            <w:r>
+              <w:rPr>
+                <w:b/>
+              </w:rPr>
+              <w:t>Alt + \</w:t>
+            </w:r>
+            <w:r>
+              <w:t xml:space="preserve"> (hoặc nút Toggle TeX) để công thức chuyển sang LaTeX siêu nhẹ và nét chuẩn 100%.</w:t>
               <w:br/>
             </w:r>
             <w:r>
@@ -4157,6 +4192,70 @@
         <w:t>) (0,2 điểm).</w:t>
       </w:r>
     </w:p>
+    <w:p>
+      <w:pPr>
+        <w:jc w:val="center"/>
+      </w:pPr>
+      <w:r>
+        <w:t>─────────────────────────────────────────────</w:t>
+      </w:r>
+    </w:p>
+    <w:tbl>
+      <w:tblPr>
+        <w:tblW w:type="auto" w:w="0"/>
+        <w:jc w:val="center"/>
+        <w:tblLook w:firstColumn="1" w:firstRow="1" w:lastColumn="0" w:lastRow="0" w:noHBand="0" w:noVBand="1" w:val="04A0"/>
+      </w:tblPr>
+      <w:tblGrid>
+        <w:gridCol w:w="8640"/>
+      </w:tblGrid>
+      <w:tr>
+        <w:tc>
+          <w:tcPr>
+            <w:tcW w:type="dxa" w:w="8640"/>
+          </w:tcPr>
+          <w:p>
+            <w:r>
+              <w:rPr>
+                <w:b/>
+                <w:sz w:val="22"/>
+              </w:rPr>
+              <w:t>📌 CHÚ Ý QUAN TRỌNG KHI NẠP ĐỀ LÊN HỆ THỐNG:</w:t>
+              <w:br/>
+            </w:r>
+            <w:r>
+              <w:rPr>
+                <w:b/>
+              </w:rPr>
+              <w:t xml:space="preserve">1. Đề không cần chuyển LaTeX: </w:t>
+            </w:r>
+            <w:r>
+              <w:t>Hệ thống nhận dạng trực tiếp file Word (.docx) thông thường (dùng MathType, Word Equation hoặc ký hiệu chỉ số), tự động nhận diện đúng 100% câu hỏi, các phương án, đáp án đúng (tô màu đỏ), công thức và hình vẽ minh họa.</w:t>
+              <w:br/>
+            </w:r>
+            <w:r>
+              <w:rPr>
+                <w:b/>
+              </w:rPr>
+              <w:t xml:space="preserve">2. Phím tắt Toggle TeX (Alt + \): </w:t>
+            </w:r>
+            <w:r>
+              <w:t>Nếu muốn công thức MathType chuyển sang dạng LaTeX siêu nhẹ và sắc nét nhất, chỉ cần bôi đen và nhấn tổ hợp phím Alt + \ (hoặc nút Toggle TeX trên thanh MathType trong Word).</w:t>
+              <w:br/>
+            </w:r>
+            <w:r>
+              <w:rPr>
+                <w:b/>
+              </w:rPr>
+              <w:t xml:space="preserve">3. Phím tắt soạn thảo tiện lợi trong Word: </w:t>
+            </w:r>
+            <w:r>
+              <w:t>Gõ công thức Toán: Alt + = | Chỉ số dưới Hóa học (H₂SO₄, CO₂): Ctrl + = | Chỉ số trên (ion Fe³⁺, số mũ x²): Ctrl + Shift + =.</w:t>
+            </w:r>
+          </w:p>
+        </w:tc>
+      </w:tr>
+    </w:tbl>
     <w:sectPr>
       <w:pgSz w:w="12240" w:h="15840"/>
       <w:pgMar w:top="1440" w:right="1800" w:bottom="1440" w:left="1800" w:header="720" w:footer="720" w:gutter="0"/>

</xml_diff>

<commit_message>
Bo dong truoc Cach 1 tren web va file Word mau, giu o muc Chu y cuoi de
</commit_message>
<xml_diff>
--- a/app/resources/mau_de_thi_gdpt2026.docx
+++ b/app/resources/mau_de_thi_gdpt2026.docx
@@ -60,41 +60,6 @@
                 <w:sz w:val="22"/>
               </w:rPr>
               <w:t>📌 QUY ƯỚC ĐÁNH DẤU ĐÁP ÁN KHI SOẠN ĐỀ CHO HỆ THỐNG:</w:t>
-              <w:br/>
-            </w:r>
-            <w:r>
-              <w:t xml:space="preserve">• </w:t>
-            </w:r>
-            <w:r>
-              <w:rPr>
-                <w:b/>
-              </w:rPr>
-              <w:t xml:space="preserve">ĐỀ KHÔNG CẦN CHUYỂN LATEX: </w:t>
-            </w:r>
-            <w:r>
-              <w:t>Hệ thống hỗ trợ nạp trực tiếp file Word (.docx) thông thường, vẫn tự động nhận diện đúng 100% câu hỏi, đáp án, công thức MathType, Word Equation và hình vẽ.</w:t>
-              <w:br/>
-            </w:r>
-            <w:r>
-              <w:t xml:space="preserve">• </w:t>
-            </w:r>
-            <w:r>
-              <w:rPr>
-                <w:b/>
-              </w:rPr>
-              <w:t xml:space="preserve">Mẹo Toggle TeX (Alt + \): </w:t>
-            </w:r>
-            <w:r>
-              <w:t xml:space="preserve">Nếu dùng MathType trong Word, bấm tổ hợp phím </w:t>
-            </w:r>
-            <w:r>
-              <w:rPr>
-                <w:b/>
-              </w:rPr>
-              <w:t>Alt + \</w:t>
-            </w:r>
-            <w:r>
-              <w:t xml:space="preserve"> (hoặc nút Toggle TeX) để công thức chuyển sang LaTeX siêu nhẹ và nét chuẩn 100%.</w:t>
               <w:br/>
             </w:r>
             <w:r>

</xml_diff>